<commit_message>
GDPR Art. 34 precision in supplier breach clause
</commit_message>
<xml_diff>
--- a/docx/isms/supplier-security-assessment.docx
+++ b/docx/isms/supplier-security-assessment.docx
@@ -1644,7 +1644,7 @@
           <w:b w:val="0"/>
           <w:i w:val="0"/>
         </w:rPr>
-        <w:t xml:space="preserve"> Breach notification clause (within </w:t>
+        <w:t xml:space="preserve"> Breach notification clause (authority notification within </w:t>
       </w:r>
       <w:r>
         <w:fldChar w:fldCharType="begin"/>
@@ -1664,7 +1664,7 @@
           <w:b w:val="0"/>
           <w:i w:val="0"/>
         </w:rPr>
-        <w:t xml:space="preserve"> hours)</w:t>
+        <w:t xml:space="preserve"> hours per applicable law; customer notification per contract — GDPR Art. 34: without undue delay where high risk is likely)</w:t>
       </w:r>
     </w:p>
     <w:p>

</xml_diff>